<commit_message>
Cumplir requisitos instrucciones: +50 págs, resumen/abstract 150-250 palabras, 5 keywords, M&M secciones 3.8-3.10, índice de acrónimos
</commit_message>
<xml_diff>
--- a/MUBI_JAIMEHERNÁNGIL_TFM_ENTREGA3.docx
+++ b/MUBI_JAIMEHERNÁNGIL_TFM_ENTREGA3.docx
@@ -497,7 +497,7 @@
         </w:rPr>
       </w:pPr>
       <w:r>
-        <w:t xml:space="preserve">Este trabajo presenta una evaluación comparativa de dos herramientas bioinformáticas para el diseño de guías CRISPR/Cas9: CHOPCHOP (plataforma web) y crisprVerse (pipeline programático en R/Bioconductor). Como referencia experimental se utilizó un subconjunto de 20 genes del dataset Perturb-seq de Replogle et al. (2022), obteniendo 40 guías CRISPRi experimentales. Las guías top-3 generadas in silico no presentaron coincidencia exacta con las experimentales (0% en ambas herramientas). El análisis de distancia Hamming reveló una divergencia media de ∼13/20 nt, coherente con la diferencia en criterios de diseño: knockout en exones frente a represión TSS-proximal. El análisis subóptimo demostró que ambas herramientas generan las guías experimentales en posiciones más bajas del ranking: CHOPCHOP con 22,5% de coincidencias exactas y crisprVerse con 47,5%, alcanzando este último el 100% de cobertura al considerar todos los candidatos.</w:t>
+        <w:t xml:space="preserve">Este trabajo presenta una evaluación comparativa de dos herramientas bioinformáticas para el diseño de guías CRISPR/Cas9: CHOPCHOP (plataforma web) y crisprVerse (pipeline programático en R/Bioconductor). Como referencia experimental se utilizó un subconjunto de 20 genes del dataset Perturb-seq de Replogle et al. (2022), agrupados en cinco bloques funcionales, obteniendo 40 guías CRISPRi experimentales. Las guías top-3 generadas in silico no presentaron coincidencia exacta con las experimentales (0% en ambas herramientas). El análisis de distancia Hamming sobre el conjunto top-3 reveló una divergencia media de ∼13/20 nt, coherente con la diferencia fundamental en los criterios de diseño: optimización para knockout en regiones codificantes frente a represión transcripcional en regiones TSS-proximales. El análisis subóptimo, realizado sobre los rankings completos, demostró que ambas herramientas son capaces de generar las secuencias de las guías experimentales, aunque las relegan a posiciones bajas por inadecuación de los criterios de priorización: CHOPCHOP presentó un 22,5% de coincidencias exactas y crisprVerse un 47,5%, alcanzando este último el 100% de cobertura (Hamming ≤ 3) al considerar la totalidad de candidatos generados. Los resultados subrayan la importancia de adaptar la selección y configuración de herramientas al contexto experimental específico.</w:t>
       </w:r>
     </w:p>
     <w:p>
@@ -524,7 +524,7 @@
         <w:rPr>
           <w:lang w:eastAsia="en-US"/>
         </w:rPr>
-        <w:t xml:space="preserve"> CRISPR/Cas9, benchmarking, diseño de guías</w:t>
+        <w:t xml:space="preserve"> CRISPR/Cas9, benchmarking, diseño de guías sgRNA, CRISPRi, bioinformática</w:t>
       </w:r>
     </w:p>
     <w:p>
@@ -568,7 +568,7 @@
     </w:p>
     <w:p>
       <w:r>
-        <w:t xml:space="preserve">This study presents a comparative evaluation of two bioinformatic tools for CRISPR/Cas9 guide RNA design: CHOPCHOP (web-based platform) and crisprVerse (programmatic pipeline in R/Bioconductor). A subset of 20 genes from the Perturb-seq dataset by Replogle et al. (2022) was used as experimental reference, yielding 40 CRISPRi guides. Top-3 in silico guides showed no exact match with experimental guides (0% for both tools). Hamming distance analysis revealed a mean divergence of ∼13/20 nt, consistent with the fundamental difference in design objectives: exon-targeting knockout versus TSS-proximal repression. Suboptimal analysis demonstrated that both tools generate experimental sequences but rank them poorly: CHOPCHOP achieved 22.5% exact matches and crisprVerse 47.5%, with crisprVerse reaching 100% coverage when all candidates were considered. Results highlight the importance of matching tool selection and configuration to the specific experimental context.</w:t>
+        <w:t xml:space="preserve">This study presents a comparative evaluation of two bioinformatic tools for CRISPR/Cas9 guide RNA design: CHOPCHOP (web-based platform) and crisprVerse (programmatic pipeline in R/Bioconductor). A subset of 20 genes from the Perturb-seq dataset by Replogle et al. (2022), grouped into five functional blocks, was used as experimental reference, yielding 40 CRISPRi guides. Top-3 in silico guides showed no exact match with experimental guides (0% concordance for both tools). Hamming distance analysis over the top-3 set revealed a mean divergence of approximately 13/20 nt, consistent with the fundamental difference in design objectives: exon-targeting knockout optimization versus TSS-proximal transcriptional repression. A suboptimal ranking analysis, performed over the complete candidate sets, demonstrated that both tools are capable of generating the experimental guide sequences, but assign them low priority positions due to misaligned scoring criteria. CHOPCHOP showed 22.5% exact matches and crisprVerse 47.5% in their full rankings; crisprVerse achieved 100% coverage (Hamming ≤ 3) when all generated candidates were considered. Analysis by functional block revealed the Mediator Complex as the most similar group, while mitochondrial function genes showed the greatest divergence. Results underscore the necessity of adapting tool selection and configuration to the specific experimental context.</w:t>
       </w:r>
     </w:p>
     <w:p>
@@ -580,7 +580,7 @@
         <w:t>Keywords</w:t>
       </w:r>
       <w:r>
-        <w:t xml:space="preserve">: CRISPR/Cas9, benchmarking, guide RNA design, bioinformatics</w:t>
+        <w:t xml:space="preserve">: CRISPR/Cas9, benchmarking, guide RNA design, CRISPRi, bioinformatics</w:t>
         <w:br w:type="page"/>
       </w:r>
     </w:p>
@@ -4833,6 +4833,65 @@
       </w:r>
     </w:p>
     <w:p>
+      <w:pPr>
+        <w:pStyle w:val="Ttulo2"/>
+      </w:pPr>
+      <w:r>
+        <w:t>3.8 Análisis de similitud de secuencia: distancia Hamming</w:t>
+      </w:r>
+    </w:p>
+    <w:p>
+      <w:r>
+        <w:t xml:space="preserve">Con el objetivo de cuantificar la similitud de secuencia entre las guías generadas in silico y las guías experimentales, se calculó la distancia Hamming mínima entre cada guía experimental y el conjunto de guías top-3 generadas por cada herramienta. La distancia Hamming entre dos secuencias de igual longitud se define como el número de posiciones en las que los nucleótidos difieren. Para secuencias de 20 nucleótidos, los valores posibles oscilan entre 0 (secuencias idénticas) y 20 (secuencias completamente diferentes).</w:t>
+      </w:r>
+    </w:p>
+    <w:p>
+      <w:r>
+        <w:t xml:space="preserve">Para cada guía experimental, se calculó la distancia Hamming frente a cada una de las tres guías top-3 generadas por la herramienta correspondiente para el mismo gen, seleccionando el valor mínimo como medida representativa de la similitud entre conjuntos. El cálculo se realizó utilizando el paquete "stringdist" de R (versión 0.9.x), que implementa de forma eficiente la métrica de Hamming mediante la función stringdist() con el parámetro method = "hamming". La implementación y los resultados de este análisis están disponibles en el script 05_concordance_analysis.R del repositorio del proyecto.</w:t>
+      </w:r>
+    </w:p>
+    <w:p>
+      <w:r>
+        <w:t xml:space="preserve">Adicionalmente, se llevó a cabo un análisis específico de la región seed del protospacer, correspondiente a las posiciones 9–20 del protospacer (12 nucleótidos más próximos al PAM). Esta región es especialmente relevante desde el punto de vista funcional, ya que determina en gran medida la especificidad del complejo Cas9-sgRNA. Para esta región, se calculó igualmente la distancia Hamming entre cada guía experimental y su mejor match top-3, y se registró el porcentaje de guías con regiones seed idénticas.</w:t>
+      </w:r>
+    </w:p>
+    <w:p>
+      <w:pPr>
+        <w:pStyle w:val="Ttulo2"/>
+      </w:pPr>
+      <w:r>
+        <w:t>3.9 Análisis subóptimo: posición en el ranking completo</w:t>
+      </w:r>
+    </w:p>
+    <w:p>
+      <w:r>
+        <w:t xml:space="preserve">Para evaluar si las guías experimentales están incluidas en el espacio de candidatos generados por cada herramienta —con independencia de su posición en el ranking—, se amplió el análisis al conjunto completo de guías candidatas. En el caso de CHOPCHOP, se cargaron los archivos de ranking completo descargados de la interfaz web para cada gen (formato tabular, extensión .txt). En el caso de crisprVerse, se emplearon los archivos generados por el pipeline previo a la aplicación del filtro top-3, que contienen todos los candidatos identificados sobre las coordenadas genómicas de cada gen. Para cada guía experimental, se buscó la posición exacta en el ranking y se calculó la distancia Hamming mínima contra la totalidad de candidatos.</w:t>
+      </w:r>
+    </w:p>
+    <w:p>
+      <w:r>
+        <w:t xml:space="preserve">A partir de estos datos, se construyó una curva de cobertura acumulada según el umbral top-N, definida como el porcentaje de guías experimentales que presentan al menos un candidato con Hamming ≤ 3 dentro de las N primeras posiciones del ranking. Los umbrales evaluados fueron: 3, 5, 10, 20, 50, 100, 200, 500, 1000, 5000, 10000, y la totalidad de candidatos. Este análisis permite determinar cuántas guías experimentales serían recuperadas si se ampliara el umbral de selección de top-3 a top-N, constituyendo una evaluación de la sensibilidad de cada pipeline en función del criterio de selección aplicado. El script 06_suboptimal_analysis.R del repositorio recoge la implementación completa de este análisis.</w:t>
+      </w:r>
+    </w:p>
+    <w:p>
+      <w:pPr>
+        <w:pStyle w:val="Ttulo2"/>
+      </w:pPr>
+      <w:r>
+        <w:t>3.10 Análisis por bloques funcionales</w:t>
+      </w:r>
+    </w:p>
+    <w:p>
+      <w:r>
+        <w:t xml:space="preserve">Con el fin de explorar si el contexto biológico de los genes analizados influye en el comportamiento de los pipelines de diseño, los 20 genes se agruparon en cinco bloques funcionales: Complejo Integrador (INTS2, INTS8), Complejo Mediador (MED12, MED19, MED30), Elongación transcripcional (SUPT5H, SUPT6H, PAF1, CTR9, POLR2B), Función mitocondrial (HSPA9, PHB, PHB2, DNAJC19, TIMM23B) y Procesamiento de RNA (NCBP2, SRRT, DDX41), junto con dos genes de regulación y señalización (GATA1, GAB2). Esta clasificación se realizó en base a la función molecular descrita en la base de datos Gene Ontology y a la literatura de referencia.</w:t>
+      </w:r>
+    </w:p>
+    <w:p>
+      <w:r>
+        <w:t xml:space="preserve">Para cada bloque, se calcularon los estadísticos descriptivos de la distancia Hamming mínima (top-3) y de la cobertura exacta en el ranking completo, permitiendo identificar diferencias sistemáticas entre grupos funcionales. Asimismo, se evaluaron las diferencias en contenido GC de las guías generadas por ambas herramientas a nivel de bloque funcional, con el objetivo de detectar posibles sesgos en los criterios de diseño relacionados con la composición de secuencia. Los resultados se presentan en forma de gráficos de caja y barras y se recogen en el script 07_functional_blocks.R del repositorio del proyecto.</w:t>
+      </w:r>
+    </w:p>
+    <w:p>
       <w:r>
         <w:t xml:space="preserve">Todos los scripts generados en este estudio, así como los datasets procesados y las figuras producidas, están disponibles públicamente en el siguiente repositorio de GitHub: </w:t>
       </w:r>
@@ -9002,6 +9061,284 @@
         </w:numPr>
         <w:ind w:left="360"/>
       </w:pPr>
+    </w:p>
+    <w:p>
+      <w:pPr>
+        <w:pStyle w:val="Ttulo1sinnumerar"/>
+      </w:pPr>
+      <w:r>
+        <w:br w:type="page"/>
+        <w:t>Índice de acrónimos</w:t>
+      </w:r>
+    </w:p>
+    <w:p>
+      <w:r>
+        <w:t xml:space="preserve">A continuación se recogen los principales acrónimos utilizados a lo largo del presente trabajo, ordenados alfabéticamente.</w:t>
+      </w:r>
+    </w:p>
+    <w:p>
+      <w:r>
+        <w:rPr>
+          <w:b/>
+        </w:rPr>
+        <w:t xml:space="preserve">ATAC-seq</w:t>
+      </w:r>
+      <w:r>
+        <w:t xml:space="preserve">: Assay for Transposase-Accessible Chromatin using sequencing</w:t>
+      </w:r>
+    </w:p>
+    <w:p>
+      <w:r>
+        <w:rPr>
+          <w:b/>
+        </w:rPr>
+        <w:t xml:space="preserve">cas9</w:t>
+      </w:r>
+      <w:r>
+        <w:t xml:space="preserve">: CRISPR-associated protein 9</w:t>
+      </w:r>
+    </w:p>
+    <w:p>
+      <w:r>
+        <w:rPr>
+          <w:b/>
+        </w:rPr>
+        <w:t xml:space="preserve">CRISPR</w:t>
+      </w:r>
+      <w:r>
+        <w:t xml:space="preserve">: Clustered Regularly Interspaced Short Palindromic Repeats</w:t>
+      </w:r>
+    </w:p>
+    <w:p>
+      <w:r>
+        <w:rPr>
+          <w:b/>
+        </w:rPr>
+        <w:t xml:space="preserve">CRISPRa</w:t>
+      </w:r>
+      <w:r>
+        <w:t xml:space="preserve">: CRISPR activation (activación transcripcional mediada por CRISPR)</w:t>
+      </w:r>
+    </w:p>
+    <w:p>
+      <w:r>
+        <w:rPr>
+          <w:b/>
+        </w:rPr>
+        <w:t xml:space="preserve">CRISPRi</w:t>
+      </w:r>
+      <w:r>
+        <w:t xml:space="preserve">: CRISPR interference (represión transcripcional mediada por CRISPR)</w:t>
+      </w:r>
+    </w:p>
+    <w:p>
+      <w:r>
+        <w:rPr>
+          <w:b/>
+        </w:rPr>
+        <w:t xml:space="preserve">CSV</w:t>
+      </w:r>
+      <w:r>
+        <w:t xml:space="preserve">: Comma-Separated Values (formato de archivo tabular)</w:t>
+      </w:r>
+    </w:p>
+    <w:p>
+      <w:r>
+        <w:rPr>
+          <w:b/>
+        </w:rPr>
+        <w:t xml:space="preserve">dCas9</w:t>
+      </w:r>
+      <w:r>
+        <w:t xml:space="preserve">: dead Cas9 (variante catalíticamente inactiva de Cas9)</w:t>
+      </w:r>
+    </w:p>
+    <w:p>
+      <w:r>
+        <w:rPr>
+          <w:b/>
+        </w:rPr>
+        <w:t xml:space="preserve">DE</w:t>
+      </w:r>
+      <w:r>
+        <w:t xml:space="preserve">: Desviación estándar</w:t>
+      </w:r>
+    </w:p>
+    <w:p>
+      <w:r>
+        <w:rPr>
+          <w:b/>
+        </w:rPr>
+        <w:t xml:space="preserve">DNA / ADN</w:t>
+      </w:r>
+      <w:r>
+        <w:t xml:space="preserve">: Deoxyribonucleic acid / Ácido desoxirribonucleico</w:t>
+      </w:r>
+    </w:p>
+    <w:p>
+      <w:r>
+        <w:rPr>
+          <w:b/>
+        </w:rPr>
+        <w:t xml:space="preserve">GC</w:t>
+      </w:r>
+      <w:r>
+        <w:t xml:space="preserve">: Contenido de guanina y citosina en una secuencia de ácido nucleico (%)</w:t>
+      </w:r>
+    </w:p>
+    <w:p>
+      <w:r>
+        <w:rPr>
+          <w:b/>
+        </w:rPr>
+        <w:t xml:space="preserve">HDR</w:t>
+      </w:r>
+      <w:r>
+        <w:t xml:space="preserve">: Homology-Directed Repair (reparación dirigida por homología)</w:t>
+      </w:r>
+    </w:p>
+    <w:p>
+      <w:r>
+        <w:rPr>
+          <w:b/>
+        </w:rPr>
+        <w:t xml:space="preserve">indel</w:t>
+      </w:r>
+      <w:r>
+        <w:t xml:space="preserve">: Inserción o deleción de nucleótidos en el sitio de corte</w:t>
+      </w:r>
+    </w:p>
+    <w:p>
+      <w:r>
+        <w:rPr>
+          <w:b/>
+        </w:rPr>
+        <w:t xml:space="preserve">KO</w:t>
+      </w:r>
+      <w:r>
+        <w:t xml:space="preserve">: Knockout (eliminación funcional de un gen)</w:t>
+      </w:r>
+    </w:p>
+    <w:p>
+      <w:r>
+        <w:rPr>
+          <w:b/>
+        </w:rPr>
+        <w:t xml:space="preserve">MM0, MM1, MM2, MM3</w:t>
+      </w:r>
+      <w:r>
+        <w:t xml:space="preserve">: Número de sitios genómicos con 0, 1, 2 o 3 mismatches respecto a la secuencia diana (métrica off-target de CHOPCHOP)</w:t>
+      </w:r>
+    </w:p>
+    <w:p>
+      <w:r>
+        <w:rPr>
+          <w:b/>
+        </w:rPr>
+        <w:t xml:space="preserve">NHEJ</w:t>
+      </w:r>
+      <w:r>
+        <w:t xml:space="preserve">: Non-Homologous End Joining (unión de extremos no homólogos)</w:t>
+      </w:r>
+    </w:p>
+    <w:p>
+      <w:r>
+        <w:rPr>
+          <w:b/>
+        </w:rPr>
+        <w:t xml:space="preserve">nt</w:t>
+      </w:r>
+      <w:r>
+        <w:t xml:space="preserve">: Nucleótido(s)</w:t>
+      </w:r>
+    </w:p>
+    <w:p>
+      <w:r>
+        <w:rPr>
+          <w:b/>
+        </w:rPr>
+        <w:t xml:space="preserve">PAM</w:t>
+      </w:r>
+      <w:r>
+        <w:t xml:space="preserve">: Protospacer Adjacent Motif (secuencia adyacente reconocida por Cas9, tipicamente NGG para SpCas9)</w:t>
+      </w:r>
+    </w:p>
+    <w:p>
+      <w:r>
+        <w:rPr>
+          <w:b/>
+        </w:rPr>
+        <w:t xml:space="preserve">RNA / ARN</w:t>
+      </w:r>
+      <w:r>
+        <w:t xml:space="preserve">: Ribonucleic acid / Ácido ribonucleico</w:t>
+      </w:r>
+    </w:p>
+    <w:p>
+      <w:r>
+        <w:rPr>
+          <w:b/>
+        </w:rPr>
+        <w:t xml:space="preserve">scRNA-seq</w:t>
+      </w:r>
+      <w:r>
+        <w:t xml:space="preserve">: Single-cell RNA sequencing (secuenciación de RNA a nivel de célula individual)</w:t>
+      </w:r>
+    </w:p>
+    <w:p>
+      <w:r>
+        <w:rPr>
+          <w:b/>
+        </w:rPr>
+        <w:t xml:space="preserve">sgRNA</w:t>
+      </w:r>
+      <w:r>
+        <w:t xml:space="preserve">: Single guide RNA (RNA guía simple, compuesto por crRNA y tracrRNA fusionados)</w:t>
+      </w:r>
+    </w:p>
+    <w:p>
+      <w:r>
+        <w:rPr>
+          <w:b/>
+        </w:rPr>
+        <w:t xml:space="preserve">SpCas9</w:t>
+      </w:r>
+      <w:r>
+        <w:t xml:space="preserve">: Streptococcus pyogenes Cas9 (la variante más utilizada de la nucleasa Cas9)</w:t>
+      </w:r>
+    </w:p>
+    <w:p>
+      <w:r>
+        <w:rPr>
+          <w:b/>
+        </w:rPr>
+        <w:t xml:space="preserve">TFM</w:t>
+      </w:r>
+      <w:r>
+        <w:t xml:space="preserve">: Trabajo Fin de Máster</w:t>
+      </w:r>
+    </w:p>
+    <w:p>
+      <w:r>
+        <w:rPr>
+          <w:b/>
+        </w:rPr>
+        <w:t xml:space="preserve">TSS</w:t>
+      </w:r>
+      <w:r>
+        <w:t xml:space="preserve">: Transcription Start Site (sitio de inicio de la transcripción)</w:t>
+      </w:r>
+    </w:p>
+    <w:p>
+      <w:r>
+        <w:rPr>
+          <w:b/>
+        </w:rPr>
+        <w:t xml:space="preserve">UNIR</w:t>
+      </w:r>
+      <w:r>
+        <w:t xml:space="preserve">: Universidad Internacional de La Rioja</w:t>
+      </w:r>
     </w:p>
     <w:sectPr>
       <w:headerReference w:type="default" r:id="rId27"/>

</xml_diff>